<commit_message>
Encabezado MLA y datos reales de Melany en ensayo TED, tabú y semana 8
Co-Authored-By: Claude Opus 5.5 <noreply@anthropic.com>
Claude-Session: https://claude.ai/code/session_01BtpjWnwVSgH2GWthk4WDfq
</commit_message>
<xml_diff>
--- a/tareas-semana/1-TED-Essay.docx
+++ b/tareas-semana/1-TED-Essay.docx
@@ -2,6 +2,62 @@
 <file path=word/document.xml><?xml version="1.0" encoding="utf-8"?>
 <w:document xmlns:wpc="http://schemas.microsoft.com/office/word/2010/wordprocessingCanvas" xmlns:mo="http://schemas.microsoft.com/office/mac/office/2008/main" xmlns:mc="http://schemas.openxmlformats.org/markup-compatibility/2006" xmlns:mv="urn:schemas-microsoft-com:mac:vml" xmlns:o="urn:schemas-microsoft-com:office:office" xmlns:r="http://schemas.openxmlformats.org/officeDocument/2006/relationships" xmlns:m="http://schemas.openxmlformats.org/officeDocument/2006/math" xmlns:v="urn:schemas-microsoft-com:vml" xmlns:wp14="http://schemas.microsoft.com/office/word/2010/wordprocessingDrawing" xmlns:wp="http://schemas.openxmlformats.org/drawingml/2006/wordprocessingDrawing" xmlns:w10="urn:schemas-microsoft-com:office:word" xmlns:w="http://schemas.openxmlformats.org/wordprocessingml/2006/main" xmlns:w14="http://schemas.microsoft.com/office/word/2010/wordml" xmlns:wpg="http://schemas.microsoft.com/office/word/2010/wordprocessingGroup" xmlns:wpi="http://schemas.microsoft.com/office/word/2010/wordprocessingInk" xmlns:wne="http://schemas.microsoft.com/office/word/2006/wordml" xmlns:wps="http://schemas.microsoft.com/office/word/2010/wordprocessingShape" mc:Ignorable="w14 wp14">
   <w:body>
+    <w:p>
+      <w:pPr>
+        <w:spacing w:line="480" w:lineRule="auto" w:before="0" w:after="0"/>
+        <w:jc w:val="left"/>
+      </w:pPr>
+      <w:r>
+        <w:rPr>
+          <w:rFonts w:ascii="Times New Roman" w:hAnsi="Times New Roman" w:eastAsia="Times New Roman" w:cs="Times New Roman"/>
+          <w:color w:val="000000"/>
+          <w:sz w:val="24"/>
+        </w:rPr>
+        <w:t>Melany</w:t>
+      </w:r>
+    </w:p>
+    <w:p>
+      <w:pPr>
+        <w:spacing w:line="480" w:lineRule="auto" w:before="0" w:after="0"/>
+        <w:jc w:val="left"/>
+      </w:pPr>
+      <w:r>
+        <w:rPr>
+          <w:rFonts w:ascii="Times New Roman" w:hAnsi="Times New Roman" w:eastAsia="Times New Roman" w:cs="Times New Roman"/>
+          <w:color w:val="000000"/>
+          <w:sz w:val="24"/>
+        </w:rPr>
+        <w:t>Professor Sarah Cho</w:t>
+      </w:r>
+    </w:p>
+    <w:p>
+      <w:pPr>
+        <w:spacing w:line="480" w:lineRule="auto" w:before="0" w:after="0"/>
+        <w:jc w:val="left"/>
+      </w:pPr>
+      <w:r>
+        <w:rPr>
+          <w:rFonts w:ascii="Times New Roman" w:hAnsi="Times New Roman" w:eastAsia="Times New Roman" w:cs="Times New Roman"/>
+          <w:color w:val="000000"/>
+          <w:sz w:val="24"/>
+        </w:rPr>
+        <w:t>Communication</w:t>
+      </w:r>
+    </w:p>
+    <w:p>
+      <w:pPr>
+        <w:spacing w:line="480" w:lineRule="auto" w:before="0" w:after="0"/>
+        <w:jc w:val="left"/>
+      </w:pPr>
+      <w:r>
+        <w:rPr>
+          <w:rFonts w:ascii="Times New Roman" w:hAnsi="Times New Roman" w:eastAsia="Times New Roman" w:cs="Times New Roman"/>
+          <w:color w:val="000000"/>
+          <w:sz w:val="24"/>
+        </w:rPr>
+        <w:t>10 October 2026</w:t>
+      </w:r>
+    </w:p>
     <w:p>
       <w:pPr>
         <w:spacing w:line="480" w:lineRule="auto" w:before="0" w:after="0"/>
@@ -154,7 +210,7 @@
           <w:color w:val="000000"/>
           <w:sz w:val="24"/>
         </w:rPr>
-        <w:t>Her delivery matched the topic. She came across as extemporaneous and conversational, as if she was telling friends a story and not reading from a script. From my seat she seemed to be speaking from memory or from a few notes, because she was not tied to a manuscript or a teleprompter. She looked out at the audience and answered their laughter, which made it feel like a conversation. She used her hands to explain ideas and acted out parts of the therapy story, like imitating her therapist's reaction, and her facial expressions changed with the mood. Her voice was loud enough to reach the back, and she varied her tone. She sped up for the jokes, slowed down on the serious parts, and dropped her voice when she talked about her struggles.</w:t>
+        <w:t>Her delivery matched the topic. She came across as extemporaneous and conversational, as if she was telling friends a story and not reading from a script. From my seat she seemed to be speaking from memory or from a few notes, because she was not tied to a manuscript or a teleprompter. She looked out at the audience and answered their laughter, which made it feel like a conversation. I perform at weddings, baby showers, and birthdays with my dad, so I pay attention to how a speaker reads a room, and she seemed to pause for laughs and then pick her energy back up, which is harder than it looks. She used her hands to explain ideas and acted out parts of the therapy story, like imitating her therapist's reaction, and her facial expressions changed with the mood. Her voice was loud enough to reach the back, and she varied her tone. She sped up for the jokes, slowed down on the serious parts, and dropped her voice when she talked about her struggles.</w:t>
       </w:r>
     </w:p>
     <w:p>
@@ -168,7 +224,7 @@
           <w:color w:val="000000"/>
           <w:sz w:val="24"/>
         </w:rPr>
-        <w:t>Overall, the strongest part of this talk was the way she practiced what she preached. By sharing her own breakdown and admitting she hated vulnerability, she showed the audience what vulnerability looks like, and that made her credible. The weakest part was the large claims near the end that were not backed up with evidence. Even so, I left feeling that I had learned something useful and that I had been entertained, and I now think differently about asking for help or admitting I do not know something. As a student taking public speaking, I learned that a good speech can mix research with humor and honest personal stories, and that being real with an audience is a stronger way to connect than trying to look perfect.</w:t>
+        <w:t>Overall, the strongest part of this talk was the way she practiced what she preached. By sharing her own breakdown and admitting she hated vulnerability, she showed the audience what vulnerability looks like, and that made her credible. The weakest part was the large claims near the end that were not backed up with evidence. Even so, I left feeling that I had learned something useful and that I had been entertained, and I now think differently about asking for help or admitting I do not know something. As a Business and Finance student in a Communication course, and as someone who performs for crowds, I learned that a good speech can mix research with humor and honest personal stories. Being real with an audience is a stronger way to connect than trying to look perfect, and that is a lesson I plan to bring to my own performances.</w:t>
       </w:r>
     </w:p>
     <w:sectPr>

</xml_diff>

<commit_message>
Encabezado completo (Melany Perez, COMM 1315.001) en ensayo TED y tabú
Co-Authored-By: Claude Opus 5.5 <noreply@anthropic.com>
Claude-Session: https://claude.ai/code/session_01BtpjWnwVSgH2GWthk4WDfq
</commit_message>
<xml_diff>
--- a/tareas-semana/1-TED-Essay.docx
+++ b/tareas-semana/1-TED-Essay.docx
@@ -13,7 +13,7 @@
           <w:color w:val="000000"/>
           <w:sz w:val="24"/>
         </w:rPr>
-        <w:t>Melany</w:t>
+        <w:t>Melany Perez</w:t>
       </w:r>
     </w:p>
     <w:p>
@@ -41,7 +41,7 @@
           <w:color w:val="000000"/>
           <w:sz w:val="24"/>
         </w:rPr>
-        <w:t>Communication</w:t>
+        <w:t>COMM 1315.001</w:t>
       </w:r>
     </w:p>
     <w:p>

</xml_diff>

<commit_message>
Correcciones verificadas: TED (diapositivas, sin imitación), foro con la tarea real de Week 5, registro de semana 8 con respuestas reales
Co-Authored-By: Claude Opus 5.5 <noreply@anthropic.com>
Claude-Session: https://claude.ai/code/session_01BtpjWnwVSgH2GWthk4WDfq
</commit_message>
<xml_diff>
--- a/tareas-semana/1-TED-Essay.docx
+++ b/tareas-semana/1-TED-Essay.docx
@@ -140,7 +140,7 @@
           <w:color w:val="000000"/>
           <w:sz w:val="24"/>
         </w:rPr>
-        <w:t>After that, the talk moved through her research like a story with a beginning, middle, and end. She started with a professor who told her that "if you cannot measure it, it does not exist," which explained why she was so determined to control and predict messy subjects. Then she explained that she started by studying connection, but people kept telling her about disconnection instead. That led her to shame, which she described as the fear that something about us would make us unworthy of connection. Underneath shame, she found vulnerability, the need to be truly seen. I liked how she moved step by step, from connection to shame to vulnerability, because each point answered the question left by the one before it. She did not use slides that I could see, so the main ideas were carried by her words and by phrases she repeated, like "worthy" and "whole-hearted," which helped me follow along.</w:t>
+        <w:t>After that, the talk moved through her research like a story with a beginning, middle, and end. She started with a professor who told her that "if you cannot measure it, it does not exist," which explained why she was so determined to control and predict messy subjects. Then she explained that she started by studying connection, but people kept telling her about disconnection instead. That led her to shame, which she described as the fear that something about us would make us unworthy of connection. Underneath shame, she found vulnerability, the need to be truly seen. I liked how she moved step by step, from connection to shame to vulnerability, because each point answered the question left by the one before it. She did use slides, and I thought they worked well as visual aids because they supported her message without replacing it. They highlighted key ideas while she kept her eye contact with the audience instead of reading them, and the main ideas were still carried by her words and by phrases she repeated, like "worthy" and "whole-hearted," which helped me follow along.</w:t>
       </w:r>
     </w:p>
     <w:p>
@@ -210,7 +210,7 @@
           <w:color w:val="000000"/>
           <w:sz w:val="24"/>
         </w:rPr>
-        <w:t>Her delivery matched the topic. She came across as extemporaneous and conversational, as if she was telling friends a story and not reading from a script. From my seat she seemed to be speaking from memory or from a few notes, because she was not tied to a manuscript or a teleprompter. She looked out at the audience and answered their laughter, which made it feel like a conversation. I perform at weddings, baby showers, and birthdays with my dad, so I pay attention to how a speaker reads a room, and she seemed to pause for laughs and then pick her energy back up, which is harder than it looks. She used her hands to explain ideas and acted out parts of the therapy story, like imitating her therapist's reaction, and her facial expressions changed with the mood. Her voice was loud enough to reach the back, and she varied her tone. She sped up for the jokes, slowed down on the serious parts, and dropped her voice when she talked about her struggles.</w:t>
+        <w:t>Her delivery matched the topic. She came across as extemporaneous and conversational, as if she was telling friends a story and not reading from a script. She spoke from memory, with no notes, manuscript, or teleprompter. She made a lot of eye contact and connected very well with the audience, which made it feel like a conversation. I perform at weddings, baby showers, and birthdays with my dad, so I pay attention to how a speaker reads a room, and she paused for laughs and then picked her energy back up, which is harder than it looks. Her hand gestures were natural and not exaggerated. She also varied her voice, going soft and loud and fast and slow depending on the content.</w:t>
       </w:r>
     </w:p>
     <w:p>

</xml_diff>